<commit_message>
docs(comercial): atualiza preparo da reunião Rocha 17/ago e plano de 7 dias
- Reescreve os blocos da reunião de vendas da Rocha Auto Peças
- Detalha o preparo JDP e a divisão de tarefas Gabriel/Nicolas
- Sincroniza os .docx de onboarding com os fontes em markdown

Co-Authored-By: Claude Opus 5 (1M context) <noreply@anthropic.com>
</commit_message>
<xml_diff>
--- a/00 - IRBIS/03 - Comercial/08 - Onboarding (Word)/00 - Comece Aqui/04 - Plano 7 Dias - Quem Faz o Que.docx
+++ b/00 - IRBIS/03 - Comercial/08 - Onboarding (Word)/00 - Comece Aqui/04 - Plano 7 Dias - Quem Faz o Que.docx
@@ -440,7 +440,7 @@
                 <w:bCs/>
                 <w:b/>
               </w:rPr>
-              <w:t xml:space="preserve">5</w:t>
+              <w:t xml:space="preserve">6</w:t>
             </w:r>
           </w:p>
         </w:tc>
@@ -470,7 +470,7 @@
                 <w:bCs/>
                 <w:b/>
               </w:rPr>
-              <w:t xml:space="preserve">6</w:t>
+              <w:t xml:space="preserve">5</w:t>
             </w:r>
           </w:p>
         </w:tc>
@@ -515,13 +515,13 @@
           <w:bCs/>
           <w:b/>
         </w:rPr>
-        <w:t xml:space="preserve">Todas as 5 concluídas e as 6 parciais foram feitas por Nicolas em 14/ago.</w:t>
-      </w:r>
-      <w:r>
-        <w:t xml:space="preserve"> </w:t>
-      </w:r>
-      <w:r>
-        <w:t xml:space="preserve">O Gabriel ainda não recebeu nenhuma tarefa formalmente, o que é o gargalo que este documento existe pra resolver: ele tem 14 tarefas esperando por ele e nenhuma delas começou.</w:t>
+        <w:t xml:space="preserve">Cinco foram feitas por Nicolas em 14/ago. A sexta (G1) foi do Gabriel, no mesmo dia, e ele entregou.</w:t>
+      </w:r>
+      <w:r>
+        <w:t xml:space="preserve"> </w:t>
+      </w:r>
+      <w:r>
+        <w:t xml:space="preserve">Restam 13 tarefas dele, e a maior parte destrava na segunda, quando o material da Área de Membros sair.</w:t>
       </w:r>
     </w:p>
     <w:bookmarkEnd w:id="23"/>
@@ -565,6 +565,9 @@
         <w:pStyle w:val="Heading3"/>
       </w:pPr>
       <w:r>
+        <w:rPr>
+          <w:strike/>
+        </w:rPr>
         <w:t xml:space="preserve">G1 · As 5 respostas sobre o Rocha Auto Peças</w:t>
       </w:r>
     </w:p>
@@ -585,769 +588,23 @@
         <w:pStyle w:val="BodyText"/>
       </w:pPr>
       <w:r>
-        <w:rPr>
-          <w:strike/>
-        </w:rPr>
-        <w:t xml:space="preserve">Levantar dados públicos do Rocha: lojas, cidades, tamanho da operação, sócios</w:t>
-      </w:r>
-      <w:r>
-        <w:t xml:space="preserve"> </w:t>
-      </w:r>
-      <w:r>
-        <w:t xml:space="preserve">—</w:t>
-      </w:r>
-      <w:r>
-        <w:t xml:space="preserve"> </w:t>
-      </w:r>
-      <w:r>
-        <w:rPr>
-          <w:bCs/>
-          <w:b/>
-        </w:rPr>
-        <w:t xml:space="preserve">FEITO POR NICOLAS (14/ago)</w:t>
-      </w:r>
-    </w:p>
-    <w:p>
-      <w:pPr>
-        <w:pStyle w:val="BodyText"/>
-      </w:pPr>
-      <w:r>
-        <w:rPr>
-          <w:bCs/>
-          <w:b/>
-        </w:rPr>
-        <w:t xml:space="preserve">Sua fatia, e ela é a que falta:</w:t>
-      </w:r>
-      <w:r>
-        <w:t xml:space="preserve"> </w:t>
-      </w:r>
-      <w:r>
-        <w:t xml:space="preserve">você tem contato próximo, e as cinco respostas abaixo não existem em fonte pública.</w:t>
-      </w:r>
-    </w:p>
-    <w:tbl>
-      <w:tblPr>
-        <w:tblStyle w:val="Table"/>
-        <w:tblW w:type="pct" w:w="5000"/>
-        <w:tblLook w:firstRow="1" w:lastRow="0" w:firstColumn="0" w:lastColumn="0" w:noHBand="0" w:noVBand="0" w:val="0020"/>
-        <w:jc w:val="start"/>
-      </w:tblPr>
-      <w:tblGrid>
-        <w:gridCol w:w="3960"/>
-        <w:gridCol w:w="3960"/>
-      </w:tblGrid>
-      <w:tr>
-        <w:trPr>
-          <w:tblHeader w:val="true"/>
-        </w:trPr>
-        <w:tc>
-          <w:tcPr/>
-          <w:p>
-            <w:pPr>
-              <w:pStyle w:val="Compact"/>
-              <w:jc w:val="left"/>
-            </w:pPr>
-            <w:r>
-              <w:t xml:space="preserve">#</w:t>
-            </w:r>
-          </w:p>
-        </w:tc>
-        <w:tc>
-          <w:tcPr/>
-          <w:p>
-            <w:pPr>
-              <w:pStyle w:val="Compact"/>
-              <w:jc w:val="left"/>
-            </w:pPr>
-            <w:r>
-              <w:t xml:space="preserve">Pergunta</w:t>
-            </w:r>
-          </w:p>
-        </w:tc>
-      </w:tr>
-      <w:tr>
-        <w:tc>
-          <w:tcPr/>
-          <w:p>
-            <w:pPr>
-              <w:pStyle w:val="Compact"/>
-              <w:jc w:val="left"/>
-            </w:pPr>
-            <w:r>
-              <w:t xml:space="preserve">1</w:t>
-            </w:r>
-          </w:p>
-        </w:tc>
-        <w:tc>
-          <w:tcPr/>
-          <w:p>
-            <w:pPr>
-              <w:pStyle w:val="Compact"/>
-              <w:jc w:val="left"/>
-            </w:pPr>
-            <w:r>
-              <w:t xml:space="preserve">Que sistema ou ERP eles usam hoje, e há quanto tempo</w:t>
-            </w:r>
-          </w:p>
-        </w:tc>
-      </w:tr>
-      <w:tr>
-        <w:tc>
-          <w:tcPr/>
-          <w:p>
-            <w:pPr>
-              <w:pStyle w:val="Compact"/>
-              <w:jc w:val="left"/>
-            </w:pPr>
-            <w:r>
-              <w:t xml:space="preserve">2</w:t>
-            </w:r>
-          </w:p>
-        </w:tc>
-        <w:tc>
-          <w:tcPr/>
-          <w:p>
-            <w:pPr>
-              <w:pStyle w:val="Compact"/>
-              <w:jc w:val="left"/>
-            </w:pPr>
-            <w:r>
-              <w:t xml:space="preserve">Cliente entra por onde: balcão, telefone, WhatsApp, televendas, site</w:t>
-            </w:r>
-          </w:p>
-        </w:tc>
-      </w:tr>
-      <w:tr>
-        <w:tc>
-          <w:tcPr/>
-          <w:p>
-            <w:pPr>
-              <w:pStyle w:val="Compact"/>
-              <w:jc w:val="left"/>
-            </w:pPr>
-            <w:r>
-              <w:t xml:space="preserve">3</w:t>
-            </w:r>
-          </w:p>
-        </w:tc>
-        <w:tc>
-          <w:tcPr/>
-          <w:p>
-            <w:pPr>
-              <w:pStyle w:val="Compact"/>
-              <w:jc w:val="left"/>
-            </w:pPr>
-            <w:r>
-              <w:t xml:space="preserve">Quantas das 180 pessoas atendem cliente direto</w:t>
-            </w:r>
-          </w:p>
-        </w:tc>
-      </w:tr>
-      <w:tr>
-        <w:tc>
-          <w:tcPr/>
-          <w:p>
-            <w:pPr>
-              <w:pStyle w:val="Compact"/>
-              <w:jc w:val="left"/>
-            </w:pPr>
-            <w:r>
-              <w:t xml:space="preserve">4</w:t>
-            </w:r>
-          </w:p>
-        </w:tc>
-        <w:tc>
-          <w:tcPr/>
-          <w:p>
-            <w:pPr>
-              <w:pStyle w:val="Compact"/>
-              <w:jc w:val="left"/>
-            </w:pPr>
-            <w:r>
-              <w:rPr>
-                <w:bCs/>
-                <w:b/>
-              </w:rPr>
-              <w:t xml:space="preserve">A Isabel participa da decisão de investir em sistema?</w:t>
-            </w:r>
-          </w:p>
-        </w:tc>
-      </w:tr>
-      <w:tr>
-        <w:tc>
-          <w:tcPr/>
-          <w:p>
-            <w:pPr>
-              <w:pStyle w:val="Compact"/>
-              <w:jc w:val="left"/>
-            </w:pPr>
-            <w:r>
-              <w:t xml:space="preserve">5</w:t>
-            </w:r>
-          </w:p>
-        </w:tc>
-        <w:tc>
-          <w:tcPr/>
-          <w:p>
-            <w:pPr>
-              <w:pStyle w:val="Compact"/>
-              <w:jc w:val="left"/>
-            </w:pPr>
-            <w:r>
-              <w:rPr>
-                <w:bCs/>
-                <w:b/>
-              </w:rPr>
-              <w:t xml:space="preserve">O que eles já tentaram nessa linha e não deu certo?</w:t>
-            </w:r>
-          </w:p>
-        </w:tc>
-      </w:tr>
-    </w:tbl>
-    <w:p>
-      <w:pPr>
-        <w:pStyle w:val="BodyText"/>
-      </w:pPr>
-      <w:r>
-        <w:rPr>
-          <w:bCs/>
-          <w:b/>
-        </w:rPr>
-        <w:t xml:space="preserve">Prazo:</w:t>
-      </w:r>
-      <w:r>
-        <w:t xml:space="preserve"> </w:t>
-      </w:r>
-      <w:r>
-        <w:t xml:space="preserve">domingo 16/ago à noite.</w:t>
-      </w:r>
-      <w:r>
-        <w:t xml:space="preserve"> </w:t>
-      </w:r>
-      <w:r>
-        <w:rPr>
-          <w:bCs/>
-          <w:b/>
-        </w:rPr>
-        <w:t xml:space="preserve">Pronto quando:</w:t>
-      </w:r>
-      <w:r>
-        <w:t xml:space="preserve"> </w:t>
-      </w:r>
-      <w:r>
-        <w:t xml:space="preserve">as 5 respondidas, ou pelo menos a 4 e a 5, que são as que mudam a condução da reunião.</w:t>
-      </w:r>
-    </w:p>
-    <w:p>
-      <w:pPr>
-        <w:pStyle w:val="BodyText"/>
-      </w:pPr>
-      <w:r>
-        <w:rPr>
-          <w:bCs/>
-          <w:b/>
-        </w:rPr>
-        <w:t xml:space="preserve">O que o Nicolas já levantou, pra você não repetir:</w:t>
-      </w:r>
-      <w:r>
-        <w:t xml:space="preserve"> </w:t>
-      </w:r>
-      <w:r>
-        <w:t xml:space="preserve">7 lojas (3 em Campinas, mais Indaiatuba, Jundiaí, Araraquara e Hortolândia), +180 colaboradores, centro de distribuição próprio desde 2012, unidade nova em planejamento, sócios Roberto Rocha de Souza Pinto e Isabel Aparecida Amalfi, fundada em 1992.</w:t>
-      </w:r>
-    </w:p>
-    <w:p>
-      <w:r>
-        <w:pict>
-          <v:rect style="width:0;height:1.5pt" o:hralign="center" o:hrstd="t" o:hr="t"/>
-        </w:pict>
-      </w:r>
-    </w:p>
-    <w:bookmarkEnd w:id="25"/>
-    <w:bookmarkEnd w:id="26"/>
-    <w:bookmarkStart w:id="40" w:name="semana-de-17-a-23ago"/>
-    <w:p>
-      <w:pPr>
-        <w:pStyle w:val="Heading2"/>
-      </w:pPr>
-      <w:r>
-        <w:t xml:space="preserve">Semana de 17 a 23/ago</w:t>
-      </w:r>
-    </w:p>
-    <w:bookmarkStart w:id="27" w:name="X70b0ac95b3c4cfda643d1daa5f158237d525772"/>
-    <w:p>
-      <w:pPr>
-        <w:pStyle w:val="Heading3"/>
-      </w:pPr>
-      <w:r>
-        <w:t xml:space="preserve">G2 · Estudar o script de SDR e o método BANT</w:t>
-      </w:r>
-    </w:p>
-    <w:p>
-      <w:pPr>
-        <w:pStyle w:val="FirstParagraph"/>
-      </w:pPr>
-      <w:r>
-        <w:rPr>
-          <w:iCs/>
-          <w:i/>
-        </w:rPr>
-        <w:t xml:space="preserve">Tarefa 2.1 do plano · sua</w:t>
-      </w:r>
-    </w:p>
-    <w:p>
-      <w:pPr>
-        <w:pStyle w:val="BodyText"/>
-      </w:pPr>
-      <w:r>
-        <w:t xml:space="preserve">Dois materiais, não um:</w:t>
-      </w:r>
-    </w:p>
-    <w:p>
-      <w:pPr>
-        <w:numPr>
-          <w:ilvl w:val="0"/>
-          <w:numId w:val="1001"/>
-        </w:numPr>
-        <w:pStyle w:val="Compact"/>
-      </w:pPr>
-      <w:r>
-        <w:rPr>
-          <w:bCs/>
-          <w:b/>
-        </w:rPr>
-        <w:t xml:space="preserve">O da Área de Membros do Grupo JDP.</w:t>
-      </w:r>
-      <w:r>
-        <w:t xml:space="preserve"> </w:t>
-      </w:r>
-      <w:r>
-        <w:t xml:space="preserve">O Nicolas traz da mentoria de segunda 17/ago</w:t>
-      </w:r>
-    </w:p>
-    <w:p>
-      <w:pPr>
-        <w:numPr>
-          <w:ilvl w:val="0"/>
-          <w:numId w:val="1001"/>
-        </w:numPr>
-        <w:pStyle w:val="Compact"/>
-      </w:pPr>
-      <w:r>
-        <w:rPr>
-          <w:bCs/>
-          <w:b/>
-        </w:rPr>
-        <w:t xml:space="preserve">O da IRBIS:</w:t>
-      </w:r>
-      <w:r>
-        <w:t xml:space="preserve"> </w:t>
-      </w:r>
-      <w:r>
-        <w:rPr>
-          <w:rStyle w:val="VerbatimChar"/>
-        </w:rPr>
-        <w:t xml:space="preserve">02 - Qualificação e Agendamento/script-qualificacao-bant-irbis.md</w:t>
-      </w:r>
-      <w:r>
-        <w:t xml:space="preserve">, reescrito em 13/ago. Esse já está adaptado pra economia real e pro funil novo</w:t>
-      </w:r>
-    </w:p>
-    <w:p>
-      <w:pPr>
-        <w:pStyle w:val="FirstParagraph"/>
-      </w:pPr>
-      <w:r>
-        <w:rPr>
-          <w:bCs/>
-          <w:b/>
-        </w:rPr>
-        <w:t xml:space="preserve">Não invente do zero.</w:t>
-      </w:r>
-      <w:r>
-        <w:t xml:space="preserve"> </w:t>
-      </w:r>
-      <w:r>
-        <w:t xml:space="preserve">O caminho já está pronto pra copiar e ajustar.</w:t>
-      </w:r>
-    </w:p>
-    <w:p>
-      <w:pPr>
-        <w:pStyle w:val="BodyText"/>
-      </w:pPr>
-      <w:r>
-        <w:rPr>
-          <w:bCs/>
-          <w:b/>
-        </w:rPr>
-        <w:t xml:space="preserve">Pronto quando:</w:t>
-      </w:r>
-      <w:r>
-        <w:t xml:space="preserve"> </w:t>
-      </w:r>
-      <w:r>
-        <w:t xml:space="preserve">você consegue rodar o BANT numa conversa sem consultar o papel.</w:t>
-      </w:r>
-    </w:p>
-    <w:p>
-      <w:r>
-        <w:pict>
-          <v:rect style="width:0;height:1.5pt" o:hralign="center" o:hrstd="t" o:hr="t"/>
-        </w:pict>
-      </w:r>
-    </w:p>
-    <w:bookmarkEnd w:id="27"/>
-    <w:bookmarkStart w:id="28" w:name="g3-rodar-os-dois-treinos-por-semana"/>
-    <w:p>
-      <w:pPr>
-        <w:pStyle w:val="Heading3"/>
-      </w:pPr>
-      <w:r>
-        <w:t xml:space="preserve">G3 · Rodar os dois treinos por semana</w:t>
-      </w:r>
-    </w:p>
-    <w:p>
-      <w:pPr>
-        <w:pStyle w:val="FirstParagraph"/>
-      </w:pPr>
-      <w:r>
-        <w:rPr>
-          <w:iCs/>
-          <w:i/>
-        </w:rPr>
-        <w:t xml:space="preserve">Tarefa 2.2 do plano · dividida com Nicolas</w:t>
-      </w:r>
-    </w:p>
-    <w:p>
-      <w:pPr>
-        <w:pStyle w:val="BodyText"/>
-      </w:pPr>
-      <w:r>
-        <w:t xml:space="preserve">Duas sessões de 1 hora por semana, com</w:t>
-      </w:r>
-      <w:r>
-        <w:t xml:space="preserve"> </w:t>
-      </w:r>
-      <w:r>
-        <w:rPr>
-          <w:bCs/>
-          <w:b/>
-        </w:rPr>
-        <w:t xml:space="preserve">dia e hora fixos na agenda</w:t>
-      </w:r>
-      <w:r>
-        <w:t xml:space="preserve">. Cada sessão roda uma simulação de ligação ou reunião com o BANT, e depois vocês revisam juntos o que travou.</w:t>
-      </w:r>
-    </w:p>
-    <w:tbl>
-      <w:tblPr>
-        <w:tblStyle w:val="Table"/>
-        <w:tblW w:type="pct" w:w="5000"/>
-        <w:tblLook w:firstRow="1" w:lastRow="0" w:firstColumn="0" w:lastColumn="0" w:noHBand="0" w:noVBand="0" w:val="0020"/>
-        <w:jc w:val="start"/>
-      </w:tblPr>
-      <w:tblGrid>
-        <w:gridCol w:w="3960"/>
-        <w:gridCol w:w="3960"/>
-      </w:tblGrid>
-      <w:tr>
-        <w:trPr>
-          <w:tblHeader w:val="true"/>
-        </w:trPr>
-        <w:tc>
-          <w:tcPr/>
-          <w:p>
-            <w:pPr>
-              <w:pStyle w:val="Compact"/>
-              <w:jc w:val="left"/>
-            </w:pPr>
-            <w:r>
-              <w:t xml:space="preserve">Quem</w:t>
-            </w:r>
-          </w:p>
-        </w:tc>
-        <w:tc>
-          <w:tcPr/>
-          <w:p>
-            <w:pPr>
-              <w:pStyle w:val="Compact"/>
-              <w:jc w:val="left"/>
-            </w:pPr>
-            <w:r>
-              <w:t xml:space="preserve">O quê</w:t>
-            </w:r>
-          </w:p>
-        </w:tc>
-      </w:tr>
-      <w:tr>
-        <w:tc>
-          <w:tcPr/>
-          <w:p>
-            <w:pPr>
-              <w:pStyle w:val="Compact"/>
-              <w:jc w:val="left"/>
-            </w:pPr>
-            <w:r>
-              <w:t xml:space="preserve">Nicolas</w:t>
-            </w:r>
-          </w:p>
-        </w:tc>
-        <w:tc>
-          <w:tcPr/>
-          <w:p>
-            <w:pPr>
-              <w:pStyle w:val="Compact"/>
-              <w:jc w:val="left"/>
-            </w:pPr>
-            <w:r>
-              <w:t xml:space="preserve">Conduz o treino e dá o retorno</w:t>
-            </w:r>
-          </w:p>
-        </w:tc>
-      </w:tr>
-      <w:tr>
-        <w:tc>
-          <w:tcPr/>
-          <w:p>
-            <w:pPr>
-              <w:pStyle w:val="Compact"/>
-              <w:jc w:val="left"/>
-            </w:pPr>
-            <w:r>
-              <w:rPr>
-                <w:bCs/>
-                <w:b/>
-              </w:rPr>
-              <w:t xml:space="preserve">Gabriel</w:t>
-            </w:r>
-          </w:p>
-        </w:tc>
-        <w:tc>
-          <w:tcPr/>
-          <w:p>
-            <w:pPr>
-              <w:pStyle w:val="Compact"/>
-              <w:jc w:val="left"/>
-            </w:pPr>
-            <w:r>
-              <w:t xml:space="preserve">Aparece preparado, roda a simulação, anota o que travou</w:t>
-            </w:r>
-          </w:p>
-        </w:tc>
-      </w:tr>
-    </w:tbl>
-    <w:p>
-      <w:pPr>
-        <w:pStyle w:val="BodyText"/>
-      </w:pPr>
-      <w:r>
-        <w:rPr>
-          <w:bCs/>
-          <w:b/>
-        </w:rPr>
-        <w:t xml:space="preserve">PARCIAL:</w:t>
-      </w:r>
-      <w:r>
-        <w:t xml:space="preserve"> </w:t>
-      </w:r>
-      <w:r>
-        <w:t xml:space="preserve">a rotina está definida no plano, mas</w:t>
-      </w:r>
-      <w:r>
-        <w:t xml:space="preserve"> </w:t>
-      </w:r>
-      <w:r>
-        <w:rPr>
-          <w:bCs/>
-          <w:b/>
-        </w:rPr>
-        <w:t xml:space="preserve">dia e hora ainda não foram marcados</w:t>
-      </w:r>
-      <w:r>
-        <w:t xml:space="preserve">. Treino sem horário na agenda não acontece.</w:t>
-      </w:r>
-    </w:p>
-    <w:p>
-      <w:pPr>
-        <w:pStyle w:val="BodyText"/>
-      </w:pPr>
-      <w:r>
-        <w:rPr>
-          <w:bCs/>
-          <w:b/>
-        </w:rPr>
-        <w:t xml:space="preserve">Pronto quando:</w:t>
-      </w:r>
-      <w:r>
-        <w:t xml:space="preserve"> </w:t>
-      </w:r>
-      <w:r>
-        <w:t xml:space="preserve">os dois horários estão no calendário dos dois, recorrentes.</w:t>
-      </w:r>
-    </w:p>
-    <w:p>
-      <w:r>
-        <w:pict>
-          <v:rect style="width:0;height:1.5pt" o:hralign="center" o:hrstd="t" o:hr="t"/>
-        </w:pict>
-      </w:r>
-    </w:p>
-    <w:bookmarkEnd w:id="28"/>
-    <w:bookmarkStart w:id="29" w:name="X8697252e84909174f6f1b69fcaedb1121bced39"/>
-    <w:p>
-      <w:pPr>
-        <w:pStyle w:val="Heading3"/>
-      </w:pPr>
-      <w:r>
-        <w:t xml:space="preserve">G4 · Aplicar o script de qualificação nos agendamentos</w:t>
-      </w:r>
-    </w:p>
-    <w:p>
-      <w:pPr>
-        <w:pStyle w:val="FirstParagraph"/>
-      </w:pPr>
-      <w:r>
-        <w:rPr>
-          <w:iCs/>
-          <w:i/>
-        </w:rPr>
-        <w:t xml:space="preserve">Tarefa 2.3 do plano · sua</w:t>
-      </w:r>
-    </w:p>
-    <w:p>
-      <w:pPr>
-        <w:pStyle w:val="BodyText"/>
-      </w:pPr>
-      <w:r>
-        <w:t xml:space="preserve">Em todo agendamento que você trouxer, roda o BANT pra separar quem tem orçamento e decisão de quem é só curiosidade.</w:t>
-      </w:r>
-    </w:p>
-    <w:p>
-      <w:pPr>
-        <w:pStyle w:val="BodyText"/>
-      </w:pPr>
-      <w:r>
-        <w:rPr>
-          <w:bCs/>
-          <w:b/>
-        </w:rPr>
-        <w:t xml:space="preserve">Anota a resposta de cada critério</w:t>
-      </w:r>
-      <w:r>
-        <w:t xml:space="preserve"> </w:t>
-      </w:r>
-      <w:r>
-        <w:t xml:space="preserve">e passa pro Nicolas só quem passou nos quatro.</w:t>
-      </w:r>
-    </w:p>
-    <w:p>
-      <w:pPr>
-        <w:pStyle w:val="BodyText"/>
-      </w:pPr>
-      <w:r>
-        <w:rPr>
-          <w:bCs/>
-          <w:b/>
-        </w:rPr>
-        <w:t xml:space="preserve">Pronto quando:</w:t>
-      </w:r>
-      <w:r>
-        <w:t xml:space="preserve"> </w:t>
-      </w:r>
-      <w:r>
-        <w:t xml:space="preserve">nenhum lead chega na agenda do Nicolas sem as quatro respostas anotadas.</w:t>
-      </w:r>
-    </w:p>
-    <w:p>
-      <w:r>
-        <w:pict>
-          <v:rect style="width:0;height:1.5pt" o:hralign="center" o:hrstd="t" o:hr="t"/>
-        </w:pict>
-      </w:r>
-    </w:p>
-    <w:bookmarkEnd w:id="29"/>
-    <w:bookmarkStart w:id="30" w:name="g5-aplicar-o-critério-de-corte-de-lead"/>
-    <w:p>
-      <w:pPr>
-        <w:pStyle w:val="Heading3"/>
-      </w:pPr>
-      <w:r>
-        <w:t xml:space="preserve">G5 · Aplicar o critério de corte de lead</w:t>
-      </w:r>
-    </w:p>
-    <w:p>
-      <w:pPr>
-        <w:pStyle w:val="FirstParagraph"/>
-      </w:pPr>
-      <w:r>
-        <w:rPr>
-          <w:iCs/>
-          <w:i/>
-        </w:rPr>
-        <w:t xml:space="preserve">Tarefa 2.4 do plano · o critério é do Nicolas, a aplicação é sua</w:t>
-      </w:r>
-    </w:p>
-    <w:p>
-      <w:pPr>
-        <w:pStyle w:val="BodyText"/>
-      </w:pPr>
-      <w:r>
-        <w:rPr>
-          <w:strike/>
-        </w:rPr>
-        <w:t xml:space="preserve">Definir o critério de corte</w:t>
-      </w:r>
-      <w:r>
-        <w:t xml:space="preserve"> </w:t>
-      </w:r>
-      <w:r>
-        <w:t xml:space="preserve">—</w:t>
-      </w:r>
-      <w:r>
-        <w:t xml:space="preserve"> </w:t>
-      </w:r>
-      <w:r>
-        <w:rPr>
-          <w:bCs/>
-          <w:b/>
-        </w:rPr>
-        <w:t xml:space="preserve">FEITO POR NICOLAS (14/ago)</w:t>
-      </w:r>
-      <w:r>
-        <w:t xml:space="preserve">, em</w:t>
-      </w:r>
-      <w:r>
-        <w:t xml:space="preserve"> </w:t>
-      </w:r>
-      <w:r>
-        <w:rPr>
-          <w:rStyle w:val="VerbatimChar"/>
-        </w:rPr>
-        <w:t xml:space="preserve">02 - Qualificação e Agendamento/criterio-corte-lead-irbis.md</w:t>
-      </w:r>
-      <w:r>
-        <w:t xml:space="preserve"> </w:t>
-      </w:r>
-      <w:r>
-        <w:t xml:space="preserve">e no seu Kit.</w:t>
-      </w:r>
-    </w:p>
-    <w:p>
-      <w:pPr>
-        <w:pStyle w:val="BodyText"/>
-      </w:pPr>
-      <w:r>
-        <w:rPr>
-          <w:bCs/>
-          <w:b/>
-        </w:rPr>
-        <w:t xml:space="preserve">Sua fatia:</w:t>
-      </w:r>
-      <w:r>
-        <w:t xml:space="preserve"> </w:t>
-      </w:r>
-      <w:r>
-        <w:t xml:space="preserve">aplicar. Os quatro obrigatórios, e falhou um não vira reunião:</w:t>
+        <w:t xml:space="preserve">✅</w:t>
+      </w:r>
+      <w:r>
+        <w:t xml:space="preserve"> </w:t>
+      </w:r>
+      <w:r>
+        <w:rPr>
+          <w:bCs/>
+          <w:b/>
+        </w:rPr>
+        <w:t xml:space="preserve">FEITO POR GABRIEL (14/ago).</w:t>
+      </w:r>
+      <w:r>
+        <w:t xml:space="preserve"> </w:t>
+      </w:r>
+      <w:r>
+        <w:t xml:space="preserve">Primeira tarefa dele, entregue com número, nome de fornecedor e o motivo real do travamento. As respostas reescreveram a oferta da reunião de segunda.</w:t>
       </w:r>
     </w:p>
     <w:tbl>
@@ -1386,19 +643,19 @@
               <w:jc w:val="left"/>
             </w:pPr>
             <w:r>
-              <w:t xml:space="preserve">Critério</w:t>
-            </w:r>
-          </w:p>
-        </w:tc>
-        <w:tc>
-          <w:tcPr/>
-          <w:p>
-            <w:pPr>
-              <w:pStyle w:val="Compact"/>
-              <w:jc w:val="left"/>
-            </w:pPr>
-            <w:r>
-              <w:t xml:space="preserve">Passa se</w:t>
+              <w:t xml:space="preserve">Pergunta</w:t>
+            </w:r>
+          </w:p>
+        </w:tc>
+        <w:tc>
+          <w:tcPr/>
+          <w:p>
+            <w:pPr>
+              <w:pStyle w:val="Compact"/>
+              <w:jc w:val="left"/>
+            </w:pPr>
+            <w:r>
+              <w:t xml:space="preserve">Resposta</w:t>
             </w:r>
           </w:p>
         </w:tc>
@@ -1424,19 +681,51 @@
               <w:jc w:val="left"/>
             </w:pPr>
             <w:r>
-              <w:t xml:space="preserve">Decisor</w:t>
-            </w:r>
-          </w:p>
-        </w:tc>
-        <w:tc>
-          <w:tcPr/>
-          <w:p>
-            <w:pPr>
-              <w:pStyle w:val="Compact"/>
-              <w:jc w:val="left"/>
-            </w:pPr>
-            <w:r>
-              <w:t xml:space="preserve">Ele decide, ou traz quem decide</w:t>
+              <w:t xml:space="preserve">Qual ERP</w:t>
+            </w:r>
+          </w:p>
+        </w:tc>
+        <w:tc>
+          <w:tcPr/>
+          <w:p>
+            <w:pPr>
+              <w:pStyle w:val="Compact"/>
+              <w:jc w:val="left"/>
+            </w:pPr>
+            <w:r>
+              <w:t xml:space="preserve">“</w:t>
+            </w:r>
+            <w:r>
+              <w:t xml:space="preserve">ERP referência de mercado</w:t>
+            </w:r>
+            <w:r>
+              <w:t xml:space="preserve">”</w:t>
+            </w:r>
+            <w:r>
+              <w:t xml:space="preserve">,</w:t>
+            </w:r>
+            <w:r>
+              <w:t xml:space="preserve"> </w:t>
+            </w:r>
+            <w:r>
+              <w:rPr>
+                <w:bCs/>
+                <w:b/>
+              </w:rPr>
+              <w:t xml:space="preserve">sem nome</w:t>
+            </w:r>
+            <w:r>
+              <w:t xml:space="preserve">. O pessoal tem dificuldade de acompanhar as inovações, o que atrapalha a operação.</w:t>
+            </w:r>
+            <w:r>
+              <w:t xml:space="preserve"> </w:t>
+            </w:r>
+            <w:r>
+              <w:rPr>
+                <w:iCs/>
+                <w:i/>
+              </w:rPr>
+              <w:t xml:space="preserve">Nome fica pra perguntar na reunião</w:t>
             </w:r>
           </w:p>
         </w:tc>
@@ -1462,19 +751,43 @@
               <w:jc w:val="left"/>
             </w:pPr>
             <w:r>
-              <w:t xml:space="preserve">Verba</w:t>
-            </w:r>
-          </w:p>
-        </w:tc>
-        <w:tc>
-          <w:tcPr/>
-          <w:p>
-            <w:pPr>
-              <w:pStyle w:val="Compact"/>
-              <w:jc w:val="left"/>
-            </w:pPr>
-            <w:r>
-              <w:t xml:space="preserve">Não recua quando ouve R$ 5.000 / R$ 10.000</w:t>
+              <w:t xml:space="preserve">Canais</w:t>
+            </w:r>
+          </w:p>
+        </w:tc>
+        <w:tc>
+          <w:tcPr/>
+          <w:p>
+            <w:pPr>
+              <w:pStyle w:val="Compact"/>
+              <w:jc w:val="left"/>
+            </w:pPr>
+            <w:r>
+              <w:t xml:space="preserve">Site, WhatsApp, balcão e telefone.</w:t>
+            </w:r>
+            <w:r>
+              <w:t xml:space="preserve"> </w:t>
+            </w:r>
+            <w:r>
+              <w:rPr>
+                <w:bCs/>
+                <w:b/>
+              </w:rPr>
+              <w:t xml:space="preserve">“</w:t>
+            </w:r>
+            <w:r>
+              <w:rPr>
+                <w:bCs/>
+                <w:b/>
+              </w:rPr>
+              <w:t xml:space="preserve">Não estamos tendo pessoas para atender nos meios digitais</w:t>
+            </w:r>
+            <w:r>
+              <w:rPr>
+                <w:bCs/>
+                <w:b/>
+              </w:rPr>
+              <w:t xml:space="preserve">”</w:t>
             </w:r>
           </w:p>
         </w:tc>
@@ -1500,37 +813,51 @@
               <w:jc w:val="left"/>
             </w:pPr>
             <w:r>
-              <w:t xml:space="preserve">Gargalo nomeado</w:t>
-            </w:r>
-          </w:p>
-        </w:tc>
-        <w:tc>
-          <w:tcPr/>
-          <w:p>
-            <w:pPr>
-              <w:pStyle w:val="Compact"/>
-              <w:jc w:val="left"/>
-            </w:pPr>
-            <w:r>
-              <w:t xml:space="preserve">Processo + gente + frequência.</w:t>
-            </w:r>
-            <w:r>
+              <w:t xml:space="preserve">Quantos atendem</w:t>
+            </w:r>
+          </w:p>
+        </w:tc>
+        <w:tc>
+          <w:tcPr/>
+          <w:p>
+            <w:pPr>
+              <w:pStyle w:val="Compact"/>
+              <w:jc w:val="left"/>
+            </w:pPr>
+            <w:r>
+              <w:rPr>
+                <w:bCs/>
+                <w:b/>
+              </w:rPr>
+              <w:t xml:space="preserve">30 hoje, precisariam de 50.</w:t>
+            </w:r>
+            <w:r>
+              <w:rPr>
+                <w:bCs/>
+                <w:b/>
+              </w:rPr>
               <w:t xml:space="preserve"> </w:t>
             </w:r>
             <w:r>
+              <w:rPr>
+                <w:bCs/>
+                <w:b/>
+              </w:rPr>
               <w:t xml:space="preserve">“</w:t>
             </w:r>
             <w:r>
-              <w:t xml:space="preserve">Quero conhecer</w:t>
-            </w:r>
-            <w:r>
+              <w:rPr>
+                <w:bCs/>
+                <w:b/>
+              </w:rPr>
+              <w:t xml:space="preserve">Não se consegue o profissional no mercado</w:t>
+            </w:r>
+            <w:r>
+              <w:rPr>
+                <w:bCs/>
+                <w:b/>
+              </w:rPr>
               <w:t xml:space="preserve">”</w:t>
-            </w:r>
-            <w:r>
-              <w:t xml:space="preserve"> </w:t>
-            </w:r>
-            <w:r>
-              <w:t xml:space="preserve">não é gargalo</w:t>
             </w:r>
           </w:p>
         </w:tc>
@@ -1556,19 +883,99 @@
               <w:jc w:val="left"/>
             </w:pPr>
             <w:r>
-              <w:t xml:space="preserve">Janela</w:t>
-            </w:r>
-          </w:p>
-        </w:tc>
-        <w:tc>
-          <w:tcPr/>
-          <w:p>
-            <w:pPr>
-              <w:pStyle w:val="Compact"/>
-              <w:jc w:val="left"/>
-            </w:pPr>
-            <w:r>
-              <w:t xml:space="preserve">Prazo ou evento concreto</w:t>
+              <w:t xml:space="preserve">A Isabel decide?</w:t>
+            </w:r>
+          </w:p>
+        </w:tc>
+        <w:tc>
+          <w:tcPr/>
+          <w:p>
+            <w:pPr>
+              <w:pStyle w:val="Compact"/>
+              <w:jc w:val="left"/>
+            </w:pPr>
+            <w:r>
+              <w:rPr>
+                <w:bCs/>
+                <w:b/>
+              </w:rPr>
+              <w:t xml:space="preserve">Não.</w:t>
+            </w:r>
+            <w:r>
+              <w:t xml:space="preserve"> </w:t>
+            </w:r>
+            <w:r>
+              <w:t xml:space="preserve">Mas reclama que o atendimento precisa melhorar</w:t>
+            </w:r>
+          </w:p>
+        </w:tc>
+      </w:tr>
+      <w:tr>
+        <w:tc>
+          <w:tcPr/>
+          <w:p>
+            <w:pPr>
+              <w:pStyle w:val="Compact"/>
+              <w:jc w:val="left"/>
+            </w:pPr>
+            <w:r>
+              <w:t xml:space="preserve">5</w:t>
+            </w:r>
+          </w:p>
+        </w:tc>
+        <w:tc>
+          <w:tcPr/>
+          <w:p>
+            <w:pPr>
+              <w:pStyle w:val="Compact"/>
+              <w:jc w:val="left"/>
+            </w:pPr>
+            <w:r>
+              <w:t xml:space="preserve">O que já tentaram</w:t>
+            </w:r>
+          </w:p>
+        </w:tc>
+        <w:tc>
+          <w:tcPr/>
+          <w:p>
+            <w:pPr>
+              <w:pStyle w:val="Compact"/>
+              <w:jc w:val="left"/>
+            </w:pPr>
+            <w:r>
+              <w:rPr>
+                <w:bCs/>
+                <w:b/>
+              </w:rPr>
+              <w:t xml:space="preserve">Integrar o WhatsApp por um programa da TOTVS.</w:t>
+            </w:r>
+            <w:r>
+              <w:rPr>
+                <w:bCs/>
+                <w:b/>
+              </w:rPr>
+              <w:t xml:space="preserve"> </w:t>
+            </w:r>
+            <w:r>
+              <w:rPr>
+                <w:bCs/>
+                <w:b/>
+              </w:rPr>
+              <w:t xml:space="preserve">“</w:t>
+            </w:r>
+            <w:r>
+              <w:rPr>
+                <w:bCs/>
+                <w:b/>
+              </w:rPr>
+              <w:t xml:space="preserve">Não temos equipe para desenvolver o processo, daí não estamos conseguindo andar</w:t>
+            </w:r>
+            <w:r>
+              <w:rPr>
+                <w:bCs/>
+                <w:b/>
+              </w:rPr>
+              <w:t xml:space="preserve">”</w:t>
             </w:r>
           </w:p>
         </w:tc>
@@ -1583,13 +990,13 @@
           <w:bCs/>
           <w:b/>
         </w:rPr>
-        <w:t xml:space="preserve">Fura a fila:</w:t>
-      </w:r>
-      <w:r>
-        <w:t xml:space="preserve"> </w:t>
-      </w:r>
-      <w:r>
-        <w:t xml:space="preserve">quem já tentou resolver com ferramenta pronta e a ferramenta não conheceu a operação.</w:t>
+        <w:t xml:space="preserve">O que isso mudou:</w:t>
+      </w:r>
+      <w:r>
+        <w:t xml:space="preserve"> </w:t>
+      </w:r>
+      <w:r>
+        <w:t xml:space="preserve">o Rocha não tem problema de software. Tem um buraco de 20 pessoas que o mercado não vende, e a ferramenta que ele comprou pra resolver está parada pelo mesmo motivo. Blocos 2, 4 e 5 da reunião foram reescritos em cima disso.</w:t>
       </w:r>
     </w:p>
     <w:p>
@@ -1599,14 +1006,24 @@
         </w:pict>
       </w:r>
     </w:p>
-    <w:bookmarkEnd w:id="30"/>
-    <w:bookmarkStart w:id="31" w:name="g6-registrar-os-números-da-semana"/>
+    <w:bookmarkEnd w:id="25"/>
+    <w:bookmarkEnd w:id="26"/>
+    <w:bookmarkStart w:id="40" w:name="semana-de-17-a-23ago"/>
+    <w:p>
+      <w:pPr>
+        <w:pStyle w:val="Heading2"/>
+      </w:pPr>
+      <w:r>
+        <w:t xml:space="preserve">Semana de 17 a 23/ago</w:t>
+      </w:r>
+    </w:p>
+    <w:bookmarkStart w:id="27" w:name="X70b0ac95b3c4cfda643d1daa5f158237d525772"/>
     <w:p>
       <w:pPr>
         <w:pStyle w:val="Heading3"/>
       </w:pPr>
       <w:r>
-        <w:t xml:space="preserve">G6 · Registrar os números da semana</w:t>
+        <w:t xml:space="preserve">G2 · Estudar o script de SDR e o método BANT</w:t>
       </w:r>
     </w:p>
     <w:p>
@@ -1618,7 +1035,7 @@
           <w:iCs/>
           <w:i/>
         </w:rPr>
-        <w:t xml:space="preserve">Tarefa 2.5 do plano · dividida com Nicolas</w:t>
+        <w:t xml:space="preserve">Tarefa 2.1 do plano · sua</w:t>
       </w:r>
     </w:p>
     <w:p>
@@ -1626,26 +1043,75 @@
         <w:pStyle w:val="BodyText"/>
       </w:pPr>
       <w:r>
-        <w:rPr>
-          <w:strike/>
-        </w:rPr>
-        <w:t xml:space="preserve">Definir quais números medir</w:t>
-      </w:r>
-      <w:r>
-        <w:t xml:space="preserve"> </w:t>
-      </w:r>
-      <w:r>
-        <w:t xml:space="preserve">—</w:t>
-      </w:r>
-      <w:r>
-        <w:t xml:space="preserve"> </w:t>
-      </w:r>
-      <w:r>
-        <w:rPr>
-          <w:bCs/>
-          <w:b/>
-        </w:rPr>
-        <w:t xml:space="preserve">FEITO POR NICOLAS (14/ago)</w:t>
+        <w:t xml:space="preserve">Dois materiais, não um:</w:t>
+      </w:r>
+    </w:p>
+    <w:p>
+      <w:pPr>
+        <w:numPr>
+          <w:ilvl w:val="0"/>
+          <w:numId w:val="1001"/>
+        </w:numPr>
+        <w:pStyle w:val="Compact"/>
+      </w:pPr>
+      <w:r>
+        <w:rPr>
+          <w:bCs/>
+          <w:b/>
+        </w:rPr>
+        <w:t xml:space="preserve">O da Área de Membros do Grupo JDP.</w:t>
+      </w:r>
+      <w:r>
+        <w:t xml:space="preserve"> </w:t>
+      </w:r>
+      <w:r>
+        <w:t xml:space="preserve">O Nicolas traz da mentoria de segunda 17/ago</w:t>
+      </w:r>
+    </w:p>
+    <w:p>
+      <w:pPr>
+        <w:numPr>
+          <w:ilvl w:val="0"/>
+          <w:numId w:val="1001"/>
+        </w:numPr>
+        <w:pStyle w:val="Compact"/>
+      </w:pPr>
+      <w:r>
+        <w:rPr>
+          <w:bCs/>
+          <w:b/>
+        </w:rPr>
+        <w:t xml:space="preserve">O da IRBIS:</w:t>
+      </w:r>
+      <w:r>
+        <w:t xml:space="preserve"> </w:t>
+      </w:r>
+      <w:r>
+        <w:rPr>
+          <w:rStyle w:val="VerbatimChar"/>
+        </w:rPr>
+        <w:t xml:space="preserve">02 - Qualificação e Agendamento/script-qualificacao-bant-irbis.md</w:t>
+      </w:r>
+      <w:r>
+        <w:t xml:space="preserve">, reescrito em 13/ago. Esse já está adaptado pra economia real e pro funil novo</w:t>
+      </w:r>
+    </w:p>
+    <w:p>
+      <w:pPr>
+        <w:pStyle w:val="FirstParagraph"/>
+      </w:pPr>
+      <w:r>
+        <w:rPr>
+          <w:bCs/>
+          <w:b/>
+        </w:rPr>
+        <w:t xml:space="preserve">Não invente do zero.</w:t>
+      </w:r>
+      <w:r>
+        <w:t xml:space="preserve"> </w:t>
+      </w:r>
+      <w:r>
+        <w:t xml:space="preserve">O caminho já está pronto pra copiar e ajustar.</w:t>
       </w:r>
     </w:p>
     <w:p>
@@ -1657,207 +1123,13 @@
           <w:bCs/>
           <w:b/>
         </w:rPr>
-        <w:t xml:space="preserve">Sua fatia:</w:t>
-      </w:r>
-      <w:r>
-        <w:t xml:space="preserve"> </w:t>
-      </w:r>
-      <w:r>
-        <w:t xml:space="preserve">preencher, toda semana, os quatro:</w:t>
-      </w:r>
-    </w:p>
-    <w:tbl>
-      <w:tblPr>
-        <w:tblStyle w:val="Table"/>
-        <w:tblW w:type="auto" w:w="0"/>
-        <w:tblLook w:firstRow="1" w:lastRow="0" w:firstColumn="0" w:lastColumn="0" w:noHBand="0" w:noVBand="0" w:val="0020"/>
-        <w:jc w:val="start"/>
-      </w:tblPr>
-      <w:tblGrid>
-        <w:gridCol w:w="7920"/>
-      </w:tblGrid>
-      <w:tr>
-        <w:trPr>
-          <w:tblHeader w:val="true"/>
-        </w:trPr>
-        <w:tc>
-          <w:tcPr/>
-          <w:p>
-            <w:pPr>
-              <w:pStyle w:val="Compact"/>
-              <w:jc w:val="left"/>
-            </w:pPr>
-            <w:r>
-              <w:t xml:space="preserve">Número</w:t>
-            </w:r>
-          </w:p>
-        </w:tc>
-      </w:tr>
-      <w:tr>
-        <w:tc>
-          <w:tcPr/>
-          <w:p>
-            <w:pPr>
-              <w:pStyle w:val="Compact"/>
-              <w:jc w:val="left"/>
-            </w:pPr>
-            <w:r>
-              <w:t xml:space="preserve">Conversas iniciadas</w:t>
-            </w:r>
-          </w:p>
-        </w:tc>
-      </w:tr>
-      <w:tr>
-        <w:tc>
-          <w:tcPr/>
-          <w:p>
-            <w:pPr>
-              <w:pStyle w:val="Compact"/>
-              <w:jc w:val="left"/>
-            </w:pPr>
-            <w:r>
-              <w:t xml:space="preserve">Viraram agendamento</w:t>
-            </w:r>
-          </w:p>
-        </w:tc>
-      </w:tr>
-      <w:tr>
-        <w:tc>
-          <w:tcPr/>
-          <w:p>
-            <w:pPr>
-              <w:pStyle w:val="Compact"/>
-              <w:jc w:val="left"/>
-            </w:pPr>
-            <w:r>
-              <w:t xml:space="preserve">Passaram nos 4 obrigatórios</w:t>
-            </w:r>
-          </w:p>
-        </w:tc>
-      </w:tr>
-      <w:tr>
-        <w:tc>
-          <w:tcPr/>
-          <w:p>
-            <w:pPr>
-              <w:pStyle w:val="Compact"/>
-              <w:jc w:val="left"/>
-            </w:pPr>
-            <w:r>
-              <w:t xml:space="preserve">Reprovaram dentro da reunião</w:t>
-            </w:r>
-          </w:p>
-        </w:tc>
-      </w:tr>
-    </w:tbl>
-    <w:p>
-      <w:pPr>
-        <w:pStyle w:val="BodyText"/>
-      </w:pPr>
-      <w:r>
-        <w:rPr>
-          <w:bCs/>
-          <w:b/>
-        </w:rPr>
-        <w:t xml:space="preserve">PARCIAL:</w:t>
-      </w:r>
-      <w:r>
-        <w:t xml:space="preserve"> </w:t>
-      </w:r>
-      <w:r>
-        <w:t xml:space="preserve">os números estão definidos,</w:t>
-      </w:r>
-      <w:r>
-        <w:t xml:space="preserve"> </w:t>
-      </w:r>
-      <w:r>
-        <w:rPr>
-          <w:bCs/>
-          <w:b/>
-        </w:rPr>
-        <w:t xml:space="preserve">o registro não começou</w:t>
-      </w:r>
-      <w:r>
-        <w:t xml:space="preserve">.</w:t>
-      </w:r>
-    </w:p>
-    <w:p>
-      <w:pPr>
-        <w:pStyle w:val="BodyText"/>
-      </w:pPr>
-      <w:r>
-        <w:rPr>
-          <w:bCs/>
-          <w:b/>
-        </w:rPr>
-        <w:t xml:space="preserve">Regra que não abre exceção:</w:t>
-      </w:r>
-      <w:r>
-        <w:t xml:space="preserve"> </w:t>
-      </w:r>
-      <w:r>
-        <w:t xml:space="preserve">toda conversa vira linha em</w:t>
-      </w:r>
-      <w:r>
-        <w:t xml:space="preserve"> </w:t>
-      </w:r>
-      <w:r>
-        <w:rPr>
-          <w:rStyle w:val="VerbatimChar"/>
-        </w:rPr>
-        <w:t xml:space="preserve">interacoes</w:t>
-      </w:r>
-      <w:r>
-        <w:t xml:space="preserve"> </w:t>
-      </w:r>
-      <w:r>
-        <w:t xml:space="preserve">no Supabase</w:t>
-      </w:r>
-      <w:r>
-        <w:t xml:space="preserve"> </w:t>
-      </w:r>
-      <w:r>
-        <w:rPr>
-          <w:bCs/>
-          <w:b/>
-        </w:rPr>
-        <w:t xml:space="preserve">no mesmo dia</w:t>
-      </w:r>
-      <w:r>
-        <w:t xml:space="preserve">, com</w:t>
-      </w:r>
-      <w:r>
-        <w:t xml:space="preserve"> </w:t>
-      </w:r>
-      <w:r>
-        <w:rPr>
-          <w:rStyle w:val="VerbatimChar"/>
-        </w:rPr>
-        <w:t xml:space="preserve">origem</w:t>
-      </w:r>
-      <w:r>
-        <w:t xml:space="preserve"> </w:t>
-      </w:r>
-      <w:r>
-        <w:t xml:space="preserve">preenchida. Lead sem registro é lead que vai ser reprospectado do zero daqui a dois meses.</w:t>
-      </w:r>
-    </w:p>
-    <w:p>
-      <w:pPr>
-        <w:pStyle w:val="BodyText"/>
-      </w:pPr>
-      <w:r>
-        <w:rPr>
-          <w:bCs/>
-          <w:b/>
-        </w:rPr>
         <w:t xml:space="preserve">Pronto quando:</w:t>
       </w:r>
       <w:r>
         <w:t xml:space="preserve"> </w:t>
       </w:r>
       <w:r>
-        <w:t xml:space="preserve">existe um placar preenchido toda sexta, desde a primeira semana.</w:t>
+        <w:t xml:space="preserve">você consegue rodar o BANT numa conversa sem consultar o papel.</w:t>
       </w:r>
     </w:p>
     <w:p>
@@ -1867,14 +1139,14 @@
         </w:pict>
       </w:r>
     </w:p>
-    <w:bookmarkEnd w:id="31"/>
-    <w:bookmarkStart w:id="32" w:name="X5c940c6a31de586853f18496a520e973492ce01"/>
+    <w:bookmarkEnd w:id="27"/>
+    <w:bookmarkStart w:id="28" w:name="g3-rodar-os-dois-treinos-por-semana"/>
     <w:p>
       <w:pPr>
         <w:pStyle w:val="Heading3"/>
       </w:pPr>
       <w:r>
-        <w:t xml:space="preserve">G7 · Definir a oferta de entrada do funil de aplicação</w:t>
+        <w:t xml:space="preserve">G3 · Rodar os dois treinos por semana</w:t>
       </w:r>
     </w:p>
     <w:p>
@@ -1886,7 +1158,7 @@
           <w:iCs/>
           <w:i/>
         </w:rPr>
-        <w:t xml:space="preserve">Tarefa 3.3 do plano · dividida com Nicolas</w:t>
+        <w:t xml:space="preserve">Tarefa 2.2 do plano · dividida com Nicolas</w:t>
       </w:r>
     </w:p>
     <w:p>
@@ -1894,7 +1166,20 @@
         <w:pStyle w:val="BodyText"/>
       </w:pPr>
       <w:r>
-        <w:t xml:space="preserve">O que o lead recebe ao preencher o formulário: uma análise gratuita ou uma avaliação de valor simbólico.</w:t>
+        <w:t xml:space="preserve">Duas sessões de 1 hora por semana, com</w:t>
+      </w:r>
+      <w:r>
+        <w:t xml:space="preserve"> </w:t>
+      </w:r>
+      <w:r>
+        <w:rPr>
+          <w:bCs/>
+          <w:b/>
+        </w:rPr>
+        <w:t xml:space="preserve">dia e hora fixos na agenda</w:t>
+      </w:r>
+      <w:r>
+        <w:t xml:space="preserve">. Cada sessão roda uma simulação de ligação ou reunião com o BANT, e depois vocês revisam juntos o que travou.</w:t>
       </w:r>
     </w:p>
     <w:tbl>
@@ -1958,6 +1243,864 @@
               <w:jc w:val="left"/>
             </w:pPr>
             <w:r>
+              <w:t xml:space="preserve">Conduz o treino e dá o retorno</w:t>
+            </w:r>
+          </w:p>
+        </w:tc>
+      </w:tr>
+      <w:tr>
+        <w:tc>
+          <w:tcPr/>
+          <w:p>
+            <w:pPr>
+              <w:pStyle w:val="Compact"/>
+              <w:jc w:val="left"/>
+            </w:pPr>
+            <w:r>
+              <w:rPr>
+                <w:bCs/>
+                <w:b/>
+              </w:rPr>
+              <w:t xml:space="preserve">Gabriel</w:t>
+            </w:r>
+          </w:p>
+        </w:tc>
+        <w:tc>
+          <w:tcPr/>
+          <w:p>
+            <w:pPr>
+              <w:pStyle w:val="Compact"/>
+              <w:jc w:val="left"/>
+            </w:pPr>
+            <w:r>
+              <w:t xml:space="preserve">Aparece preparado, roda a simulação, anota o que travou</w:t>
+            </w:r>
+          </w:p>
+        </w:tc>
+      </w:tr>
+    </w:tbl>
+    <w:p>
+      <w:pPr>
+        <w:pStyle w:val="BodyText"/>
+      </w:pPr>
+      <w:r>
+        <w:rPr>
+          <w:bCs/>
+          <w:b/>
+        </w:rPr>
+        <w:t xml:space="preserve">PARCIAL:</w:t>
+      </w:r>
+      <w:r>
+        <w:t xml:space="preserve"> </w:t>
+      </w:r>
+      <w:r>
+        <w:t xml:space="preserve">a rotina está definida no plano, mas</w:t>
+      </w:r>
+      <w:r>
+        <w:t xml:space="preserve"> </w:t>
+      </w:r>
+      <w:r>
+        <w:rPr>
+          <w:bCs/>
+          <w:b/>
+        </w:rPr>
+        <w:t xml:space="preserve">dia e hora ainda não foram marcados</w:t>
+      </w:r>
+      <w:r>
+        <w:t xml:space="preserve">. Treino sem horário na agenda não acontece.</w:t>
+      </w:r>
+    </w:p>
+    <w:p>
+      <w:pPr>
+        <w:pStyle w:val="BodyText"/>
+      </w:pPr>
+      <w:r>
+        <w:rPr>
+          <w:bCs/>
+          <w:b/>
+        </w:rPr>
+        <w:t xml:space="preserve">Pronto quando:</w:t>
+      </w:r>
+      <w:r>
+        <w:t xml:space="preserve"> </w:t>
+      </w:r>
+      <w:r>
+        <w:t xml:space="preserve">os dois horários estão no calendário dos dois, recorrentes.</w:t>
+      </w:r>
+    </w:p>
+    <w:p>
+      <w:r>
+        <w:pict>
+          <v:rect style="width:0;height:1.5pt" o:hralign="center" o:hrstd="t" o:hr="t"/>
+        </w:pict>
+      </w:r>
+    </w:p>
+    <w:bookmarkEnd w:id="28"/>
+    <w:bookmarkStart w:id="29" w:name="X8697252e84909174f6f1b69fcaedb1121bced39"/>
+    <w:p>
+      <w:pPr>
+        <w:pStyle w:val="Heading3"/>
+      </w:pPr>
+      <w:r>
+        <w:t xml:space="preserve">G4 · Aplicar o script de qualificação nos agendamentos</w:t>
+      </w:r>
+    </w:p>
+    <w:p>
+      <w:pPr>
+        <w:pStyle w:val="FirstParagraph"/>
+      </w:pPr>
+      <w:r>
+        <w:rPr>
+          <w:iCs/>
+          <w:i/>
+        </w:rPr>
+        <w:t xml:space="preserve">Tarefa 2.3 do plano · sua</w:t>
+      </w:r>
+    </w:p>
+    <w:p>
+      <w:pPr>
+        <w:pStyle w:val="BodyText"/>
+      </w:pPr>
+      <w:r>
+        <w:t xml:space="preserve">Em todo agendamento que você trouxer, roda o BANT pra separar quem tem orçamento e decisão de quem é só curiosidade.</w:t>
+      </w:r>
+    </w:p>
+    <w:p>
+      <w:pPr>
+        <w:pStyle w:val="BodyText"/>
+      </w:pPr>
+      <w:r>
+        <w:rPr>
+          <w:bCs/>
+          <w:b/>
+        </w:rPr>
+        <w:t xml:space="preserve">Anota a resposta de cada critério</w:t>
+      </w:r>
+      <w:r>
+        <w:t xml:space="preserve"> </w:t>
+      </w:r>
+      <w:r>
+        <w:t xml:space="preserve">e passa pro Nicolas só quem passou nos quatro.</w:t>
+      </w:r>
+    </w:p>
+    <w:p>
+      <w:pPr>
+        <w:pStyle w:val="BodyText"/>
+      </w:pPr>
+      <w:r>
+        <w:rPr>
+          <w:bCs/>
+          <w:b/>
+        </w:rPr>
+        <w:t xml:space="preserve">Pronto quando:</w:t>
+      </w:r>
+      <w:r>
+        <w:t xml:space="preserve"> </w:t>
+      </w:r>
+      <w:r>
+        <w:t xml:space="preserve">nenhum lead chega na agenda do Nicolas sem as quatro respostas anotadas.</w:t>
+      </w:r>
+    </w:p>
+    <w:p>
+      <w:r>
+        <w:pict>
+          <v:rect style="width:0;height:1.5pt" o:hralign="center" o:hrstd="t" o:hr="t"/>
+        </w:pict>
+      </w:r>
+    </w:p>
+    <w:bookmarkEnd w:id="29"/>
+    <w:bookmarkStart w:id="30" w:name="g5-aplicar-o-critério-de-corte-de-lead"/>
+    <w:p>
+      <w:pPr>
+        <w:pStyle w:val="Heading3"/>
+      </w:pPr>
+      <w:r>
+        <w:t xml:space="preserve">G5 · Aplicar o critério de corte de lead</w:t>
+      </w:r>
+    </w:p>
+    <w:p>
+      <w:pPr>
+        <w:pStyle w:val="FirstParagraph"/>
+      </w:pPr>
+      <w:r>
+        <w:rPr>
+          <w:iCs/>
+          <w:i/>
+        </w:rPr>
+        <w:t xml:space="preserve">Tarefa 2.4 do plano · o critério é do Nicolas, a aplicação é sua</w:t>
+      </w:r>
+    </w:p>
+    <w:p>
+      <w:pPr>
+        <w:pStyle w:val="BodyText"/>
+      </w:pPr>
+      <w:r>
+        <w:rPr>
+          <w:strike/>
+        </w:rPr>
+        <w:t xml:space="preserve">Definir o critério de corte</w:t>
+      </w:r>
+      <w:r>
+        <w:t xml:space="preserve"> </w:t>
+      </w:r>
+      <w:r>
+        <w:t xml:space="preserve">—</w:t>
+      </w:r>
+      <w:r>
+        <w:t xml:space="preserve"> </w:t>
+      </w:r>
+      <w:r>
+        <w:rPr>
+          <w:bCs/>
+          <w:b/>
+        </w:rPr>
+        <w:t xml:space="preserve">FEITO POR NICOLAS (14/ago)</w:t>
+      </w:r>
+      <w:r>
+        <w:t xml:space="preserve">, em</w:t>
+      </w:r>
+      <w:r>
+        <w:t xml:space="preserve"> </w:t>
+      </w:r>
+      <w:r>
+        <w:rPr>
+          <w:rStyle w:val="VerbatimChar"/>
+        </w:rPr>
+        <w:t xml:space="preserve">02 - Qualificação e Agendamento/criterio-corte-lead-irbis.md</w:t>
+      </w:r>
+      <w:r>
+        <w:t xml:space="preserve"> </w:t>
+      </w:r>
+      <w:r>
+        <w:t xml:space="preserve">e no seu Kit.</w:t>
+      </w:r>
+    </w:p>
+    <w:p>
+      <w:pPr>
+        <w:pStyle w:val="BodyText"/>
+      </w:pPr>
+      <w:r>
+        <w:rPr>
+          <w:bCs/>
+          <w:b/>
+        </w:rPr>
+        <w:t xml:space="preserve">Sua fatia:</w:t>
+      </w:r>
+      <w:r>
+        <w:t xml:space="preserve"> </w:t>
+      </w:r>
+      <w:r>
+        <w:t xml:space="preserve">aplicar. Os quatro obrigatórios, e falhou um não vira reunião:</w:t>
+      </w:r>
+    </w:p>
+    <w:tbl>
+      <w:tblPr>
+        <w:tblStyle w:val="Table"/>
+        <w:tblW w:type="pct" w:w="5000"/>
+        <w:tblLook w:firstRow="1" w:lastRow="0" w:firstColumn="0" w:lastColumn="0" w:noHBand="0" w:noVBand="0" w:val="0020"/>
+        <w:jc w:val="start"/>
+      </w:tblPr>
+      <w:tblGrid>
+        <w:gridCol w:w="2640"/>
+        <w:gridCol w:w="2640"/>
+        <w:gridCol w:w="2640"/>
+      </w:tblGrid>
+      <w:tr>
+        <w:trPr>
+          <w:tblHeader w:val="true"/>
+        </w:trPr>
+        <w:tc>
+          <w:tcPr/>
+          <w:p>
+            <w:pPr>
+              <w:pStyle w:val="Compact"/>
+              <w:jc w:val="left"/>
+            </w:pPr>
+            <w:r>
+              <w:t xml:space="preserve">#</w:t>
+            </w:r>
+          </w:p>
+        </w:tc>
+        <w:tc>
+          <w:tcPr/>
+          <w:p>
+            <w:pPr>
+              <w:pStyle w:val="Compact"/>
+              <w:jc w:val="left"/>
+            </w:pPr>
+            <w:r>
+              <w:t xml:space="preserve">Critério</w:t>
+            </w:r>
+          </w:p>
+        </w:tc>
+        <w:tc>
+          <w:tcPr/>
+          <w:p>
+            <w:pPr>
+              <w:pStyle w:val="Compact"/>
+              <w:jc w:val="left"/>
+            </w:pPr>
+            <w:r>
+              <w:t xml:space="preserve">Passa se</w:t>
+            </w:r>
+          </w:p>
+        </w:tc>
+      </w:tr>
+      <w:tr>
+        <w:tc>
+          <w:tcPr/>
+          <w:p>
+            <w:pPr>
+              <w:pStyle w:val="Compact"/>
+              <w:jc w:val="left"/>
+            </w:pPr>
+            <w:r>
+              <w:t xml:space="preserve">1</w:t>
+            </w:r>
+          </w:p>
+        </w:tc>
+        <w:tc>
+          <w:tcPr/>
+          <w:p>
+            <w:pPr>
+              <w:pStyle w:val="Compact"/>
+              <w:jc w:val="left"/>
+            </w:pPr>
+            <w:r>
+              <w:t xml:space="preserve">Decisor</w:t>
+            </w:r>
+          </w:p>
+        </w:tc>
+        <w:tc>
+          <w:tcPr/>
+          <w:p>
+            <w:pPr>
+              <w:pStyle w:val="Compact"/>
+              <w:jc w:val="left"/>
+            </w:pPr>
+            <w:r>
+              <w:t xml:space="preserve">Ele decide, ou traz quem decide</w:t>
+            </w:r>
+          </w:p>
+        </w:tc>
+      </w:tr>
+      <w:tr>
+        <w:tc>
+          <w:tcPr/>
+          <w:p>
+            <w:pPr>
+              <w:pStyle w:val="Compact"/>
+              <w:jc w:val="left"/>
+            </w:pPr>
+            <w:r>
+              <w:t xml:space="preserve">2</w:t>
+            </w:r>
+          </w:p>
+        </w:tc>
+        <w:tc>
+          <w:tcPr/>
+          <w:p>
+            <w:pPr>
+              <w:pStyle w:val="Compact"/>
+              <w:jc w:val="left"/>
+            </w:pPr>
+            <w:r>
+              <w:t xml:space="preserve">Verba</w:t>
+            </w:r>
+          </w:p>
+        </w:tc>
+        <w:tc>
+          <w:tcPr/>
+          <w:p>
+            <w:pPr>
+              <w:pStyle w:val="Compact"/>
+              <w:jc w:val="left"/>
+            </w:pPr>
+            <w:r>
+              <w:t xml:space="preserve">Não recua quando ouve R$ 5.000 / R$ 10.000</w:t>
+            </w:r>
+          </w:p>
+        </w:tc>
+      </w:tr>
+      <w:tr>
+        <w:tc>
+          <w:tcPr/>
+          <w:p>
+            <w:pPr>
+              <w:pStyle w:val="Compact"/>
+              <w:jc w:val="left"/>
+            </w:pPr>
+            <w:r>
+              <w:t xml:space="preserve">3</w:t>
+            </w:r>
+          </w:p>
+        </w:tc>
+        <w:tc>
+          <w:tcPr/>
+          <w:p>
+            <w:pPr>
+              <w:pStyle w:val="Compact"/>
+              <w:jc w:val="left"/>
+            </w:pPr>
+            <w:r>
+              <w:t xml:space="preserve">Gargalo nomeado</w:t>
+            </w:r>
+          </w:p>
+        </w:tc>
+        <w:tc>
+          <w:tcPr/>
+          <w:p>
+            <w:pPr>
+              <w:pStyle w:val="Compact"/>
+              <w:jc w:val="left"/>
+            </w:pPr>
+            <w:r>
+              <w:t xml:space="preserve">Processo + gente + frequência.</w:t>
+            </w:r>
+            <w:r>
+              <w:t xml:space="preserve"> </w:t>
+            </w:r>
+            <w:r>
+              <w:t xml:space="preserve">“</w:t>
+            </w:r>
+            <w:r>
+              <w:t xml:space="preserve">Quero conhecer</w:t>
+            </w:r>
+            <w:r>
+              <w:t xml:space="preserve">”</w:t>
+            </w:r>
+            <w:r>
+              <w:t xml:space="preserve"> </w:t>
+            </w:r>
+            <w:r>
+              <w:t xml:space="preserve">não é gargalo</w:t>
+            </w:r>
+          </w:p>
+        </w:tc>
+      </w:tr>
+      <w:tr>
+        <w:tc>
+          <w:tcPr/>
+          <w:p>
+            <w:pPr>
+              <w:pStyle w:val="Compact"/>
+              <w:jc w:val="left"/>
+            </w:pPr>
+            <w:r>
+              <w:t xml:space="preserve">4</w:t>
+            </w:r>
+          </w:p>
+        </w:tc>
+        <w:tc>
+          <w:tcPr/>
+          <w:p>
+            <w:pPr>
+              <w:pStyle w:val="Compact"/>
+              <w:jc w:val="left"/>
+            </w:pPr>
+            <w:r>
+              <w:t xml:space="preserve">Janela</w:t>
+            </w:r>
+          </w:p>
+        </w:tc>
+        <w:tc>
+          <w:tcPr/>
+          <w:p>
+            <w:pPr>
+              <w:pStyle w:val="Compact"/>
+              <w:jc w:val="left"/>
+            </w:pPr>
+            <w:r>
+              <w:t xml:space="preserve">Prazo ou evento concreto</w:t>
+            </w:r>
+          </w:p>
+        </w:tc>
+      </w:tr>
+    </w:tbl>
+    <w:p>
+      <w:pPr>
+        <w:pStyle w:val="BodyText"/>
+      </w:pPr>
+      <w:r>
+        <w:rPr>
+          <w:bCs/>
+          <w:b/>
+        </w:rPr>
+        <w:t xml:space="preserve">Fura a fila:</w:t>
+      </w:r>
+      <w:r>
+        <w:t xml:space="preserve"> </w:t>
+      </w:r>
+      <w:r>
+        <w:t xml:space="preserve">quem já tentou resolver com ferramenta pronta e a ferramenta não conheceu a operação.</w:t>
+      </w:r>
+    </w:p>
+    <w:p>
+      <w:r>
+        <w:pict>
+          <v:rect style="width:0;height:1.5pt" o:hralign="center" o:hrstd="t" o:hr="t"/>
+        </w:pict>
+      </w:r>
+    </w:p>
+    <w:bookmarkEnd w:id="30"/>
+    <w:bookmarkStart w:id="31" w:name="g6-registrar-os-números-da-semana"/>
+    <w:p>
+      <w:pPr>
+        <w:pStyle w:val="Heading3"/>
+      </w:pPr>
+      <w:r>
+        <w:t xml:space="preserve">G6 · Registrar os números da semana</w:t>
+      </w:r>
+    </w:p>
+    <w:p>
+      <w:pPr>
+        <w:pStyle w:val="FirstParagraph"/>
+      </w:pPr>
+      <w:r>
+        <w:rPr>
+          <w:iCs/>
+          <w:i/>
+        </w:rPr>
+        <w:t xml:space="preserve">Tarefa 2.5 do plano · dividida com Nicolas</w:t>
+      </w:r>
+    </w:p>
+    <w:p>
+      <w:pPr>
+        <w:pStyle w:val="BodyText"/>
+      </w:pPr>
+      <w:r>
+        <w:rPr>
+          <w:strike/>
+        </w:rPr>
+        <w:t xml:space="preserve">Definir quais números medir</w:t>
+      </w:r>
+      <w:r>
+        <w:t xml:space="preserve"> </w:t>
+      </w:r>
+      <w:r>
+        <w:t xml:space="preserve">—</w:t>
+      </w:r>
+      <w:r>
+        <w:t xml:space="preserve"> </w:t>
+      </w:r>
+      <w:r>
+        <w:rPr>
+          <w:bCs/>
+          <w:b/>
+        </w:rPr>
+        <w:t xml:space="preserve">FEITO POR NICOLAS (14/ago)</w:t>
+      </w:r>
+    </w:p>
+    <w:p>
+      <w:pPr>
+        <w:pStyle w:val="BodyText"/>
+      </w:pPr>
+      <w:r>
+        <w:rPr>
+          <w:bCs/>
+          <w:b/>
+        </w:rPr>
+        <w:t xml:space="preserve">Sua fatia:</w:t>
+      </w:r>
+      <w:r>
+        <w:t xml:space="preserve"> </w:t>
+      </w:r>
+      <w:r>
+        <w:t xml:space="preserve">preencher, toda semana, os quatro:</w:t>
+      </w:r>
+    </w:p>
+    <w:tbl>
+      <w:tblPr>
+        <w:tblStyle w:val="Table"/>
+        <w:tblW w:type="auto" w:w="0"/>
+        <w:tblLook w:firstRow="1" w:lastRow="0" w:firstColumn="0" w:lastColumn="0" w:noHBand="0" w:noVBand="0" w:val="0020"/>
+        <w:jc w:val="start"/>
+      </w:tblPr>
+      <w:tblGrid>
+        <w:gridCol w:w="7920"/>
+      </w:tblGrid>
+      <w:tr>
+        <w:trPr>
+          <w:tblHeader w:val="true"/>
+        </w:trPr>
+        <w:tc>
+          <w:tcPr/>
+          <w:p>
+            <w:pPr>
+              <w:pStyle w:val="Compact"/>
+              <w:jc w:val="left"/>
+            </w:pPr>
+            <w:r>
+              <w:t xml:space="preserve">Número</w:t>
+            </w:r>
+          </w:p>
+        </w:tc>
+      </w:tr>
+      <w:tr>
+        <w:tc>
+          <w:tcPr/>
+          <w:p>
+            <w:pPr>
+              <w:pStyle w:val="Compact"/>
+              <w:jc w:val="left"/>
+            </w:pPr>
+            <w:r>
+              <w:t xml:space="preserve">Conversas iniciadas</w:t>
+            </w:r>
+          </w:p>
+        </w:tc>
+      </w:tr>
+      <w:tr>
+        <w:tc>
+          <w:tcPr/>
+          <w:p>
+            <w:pPr>
+              <w:pStyle w:val="Compact"/>
+              <w:jc w:val="left"/>
+            </w:pPr>
+            <w:r>
+              <w:t xml:space="preserve">Viraram agendamento</w:t>
+            </w:r>
+          </w:p>
+        </w:tc>
+      </w:tr>
+      <w:tr>
+        <w:tc>
+          <w:tcPr/>
+          <w:p>
+            <w:pPr>
+              <w:pStyle w:val="Compact"/>
+              <w:jc w:val="left"/>
+            </w:pPr>
+            <w:r>
+              <w:t xml:space="preserve">Passaram nos 4 obrigatórios</w:t>
+            </w:r>
+          </w:p>
+        </w:tc>
+      </w:tr>
+      <w:tr>
+        <w:tc>
+          <w:tcPr/>
+          <w:p>
+            <w:pPr>
+              <w:pStyle w:val="Compact"/>
+              <w:jc w:val="left"/>
+            </w:pPr>
+            <w:r>
+              <w:t xml:space="preserve">Reprovaram dentro da reunião</w:t>
+            </w:r>
+          </w:p>
+        </w:tc>
+      </w:tr>
+    </w:tbl>
+    <w:p>
+      <w:pPr>
+        <w:pStyle w:val="BodyText"/>
+      </w:pPr>
+      <w:r>
+        <w:rPr>
+          <w:bCs/>
+          <w:b/>
+        </w:rPr>
+        <w:t xml:space="preserve">PARCIAL:</w:t>
+      </w:r>
+      <w:r>
+        <w:t xml:space="preserve"> </w:t>
+      </w:r>
+      <w:r>
+        <w:t xml:space="preserve">os números estão definidos,</w:t>
+      </w:r>
+      <w:r>
+        <w:t xml:space="preserve"> </w:t>
+      </w:r>
+      <w:r>
+        <w:rPr>
+          <w:bCs/>
+          <w:b/>
+        </w:rPr>
+        <w:t xml:space="preserve">o registro não começou</w:t>
+      </w:r>
+      <w:r>
+        <w:t xml:space="preserve">.</w:t>
+      </w:r>
+    </w:p>
+    <w:p>
+      <w:pPr>
+        <w:pStyle w:val="BodyText"/>
+      </w:pPr>
+      <w:r>
+        <w:rPr>
+          <w:bCs/>
+          <w:b/>
+        </w:rPr>
+        <w:t xml:space="preserve">Regra que não abre exceção:</w:t>
+      </w:r>
+      <w:r>
+        <w:t xml:space="preserve"> </w:t>
+      </w:r>
+      <w:r>
+        <w:t xml:space="preserve">toda conversa vira linha em</w:t>
+      </w:r>
+      <w:r>
+        <w:t xml:space="preserve"> </w:t>
+      </w:r>
+      <w:r>
+        <w:rPr>
+          <w:rStyle w:val="VerbatimChar"/>
+        </w:rPr>
+        <w:t xml:space="preserve">interacoes</w:t>
+      </w:r>
+      <w:r>
+        <w:t xml:space="preserve"> </w:t>
+      </w:r>
+      <w:r>
+        <w:t xml:space="preserve">no Supabase</w:t>
+      </w:r>
+      <w:r>
+        <w:t xml:space="preserve"> </w:t>
+      </w:r>
+      <w:r>
+        <w:rPr>
+          <w:bCs/>
+          <w:b/>
+        </w:rPr>
+        <w:t xml:space="preserve">no mesmo dia</w:t>
+      </w:r>
+      <w:r>
+        <w:t xml:space="preserve">, com</w:t>
+      </w:r>
+      <w:r>
+        <w:t xml:space="preserve"> </w:t>
+      </w:r>
+      <w:r>
+        <w:rPr>
+          <w:rStyle w:val="VerbatimChar"/>
+        </w:rPr>
+        <w:t xml:space="preserve">origem</w:t>
+      </w:r>
+      <w:r>
+        <w:t xml:space="preserve"> </w:t>
+      </w:r>
+      <w:r>
+        <w:t xml:space="preserve">preenchida. Lead sem registro é lead que vai ser reprospectado do zero daqui a dois meses.</w:t>
+      </w:r>
+    </w:p>
+    <w:p>
+      <w:pPr>
+        <w:pStyle w:val="BodyText"/>
+      </w:pPr>
+      <w:r>
+        <w:rPr>
+          <w:bCs/>
+          <w:b/>
+        </w:rPr>
+        <w:t xml:space="preserve">Pronto quando:</w:t>
+      </w:r>
+      <w:r>
+        <w:t xml:space="preserve"> </w:t>
+      </w:r>
+      <w:r>
+        <w:t xml:space="preserve">existe um placar preenchido toda sexta, desde a primeira semana.</w:t>
+      </w:r>
+    </w:p>
+    <w:p>
+      <w:r>
+        <w:pict>
+          <v:rect style="width:0;height:1.5pt" o:hralign="center" o:hrstd="t" o:hr="t"/>
+        </w:pict>
+      </w:r>
+    </w:p>
+    <w:bookmarkEnd w:id="31"/>
+    <w:bookmarkStart w:id="32" w:name="X5c940c6a31de586853f18496a520e973492ce01"/>
+    <w:p>
+      <w:pPr>
+        <w:pStyle w:val="Heading3"/>
+      </w:pPr>
+      <w:r>
+        <w:t xml:space="preserve">G7 · Definir a oferta de entrada do funil de aplicação</w:t>
+      </w:r>
+    </w:p>
+    <w:p>
+      <w:pPr>
+        <w:pStyle w:val="FirstParagraph"/>
+      </w:pPr>
+      <w:r>
+        <w:rPr>
+          <w:iCs/>
+          <w:i/>
+        </w:rPr>
+        <w:t xml:space="preserve">Tarefa 3.3 do plano · dividida com Nicolas</w:t>
+      </w:r>
+    </w:p>
+    <w:p>
+      <w:pPr>
+        <w:pStyle w:val="BodyText"/>
+      </w:pPr>
+      <w:r>
+        <w:t xml:space="preserve">O que o lead recebe ao preencher o formulário: uma análise gratuita ou uma avaliação de valor simbólico.</w:t>
+      </w:r>
+    </w:p>
+    <w:tbl>
+      <w:tblPr>
+        <w:tblStyle w:val="Table"/>
+        <w:tblW w:type="pct" w:w="5000"/>
+        <w:tblLook w:firstRow="1" w:lastRow="0" w:firstColumn="0" w:lastColumn="0" w:noHBand="0" w:noVBand="0" w:val="0020"/>
+        <w:jc w:val="start"/>
+      </w:tblPr>
+      <w:tblGrid>
+        <w:gridCol w:w="3960"/>
+        <w:gridCol w:w="3960"/>
+      </w:tblGrid>
+      <w:tr>
+        <w:trPr>
+          <w:tblHeader w:val="true"/>
+        </w:trPr>
+        <w:tc>
+          <w:tcPr/>
+          <w:p>
+            <w:pPr>
+              <w:pStyle w:val="Compact"/>
+              <w:jc w:val="left"/>
+            </w:pPr>
+            <w:r>
+              <w:t xml:space="preserve">Quem</w:t>
+            </w:r>
+          </w:p>
+        </w:tc>
+        <w:tc>
+          <w:tcPr/>
+          <w:p>
+            <w:pPr>
+              <w:pStyle w:val="Compact"/>
+              <w:jc w:val="left"/>
+            </w:pPr>
+            <w:r>
+              <w:t xml:space="preserve">O quê</w:t>
+            </w:r>
+          </w:p>
+        </w:tc>
+      </w:tr>
+      <w:tr>
+        <w:tc>
+          <w:tcPr/>
+          <w:p>
+            <w:pPr>
+              <w:pStyle w:val="Compact"/>
+              <w:jc w:val="left"/>
+            </w:pPr>
+            <w:r>
+              <w:t xml:space="preserve">Nicolas</w:t>
+            </w:r>
+          </w:p>
+        </w:tc>
+        <w:tc>
+          <w:tcPr/>
+          <w:p>
+            <w:pPr>
+              <w:pStyle w:val="Compact"/>
+              <w:jc w:val="left"/>
+            </w:pPr>
+            <w:r>
               <w:t xml:space="preserve">Constrói o formulário, escreve a narrativa da isca, decide o valor</w:t>
             </w:r>
           </w:p>
@@ -2920,7 +3063,7 @@
           <w:bCs/>
           <w:b/>
         </w:rPr>
-        <w:t xml:space="preserve">FEITO (14/ago).</w:t>
+        <w:t xml:space="preserve">FEITO (14/ago), pelos dois.</w:t>
       </w:r>
       <w:r>
         <w:t xml:space="preserve"> </w:t>
@@ -2944,17 +3087,7 @@
         <w:t xml:space="preserve"> </w:t>
       </w:r>
       <w:r>
-        <w:t xml:space="preserve">Levantados: 7 lojas, +180 colaboradores, CD próprio, unidade nova em planejamento, dois sócios decisores, estrutura multi-CNPJ, fundação em 1992.</w:t>
-      </w:r>
-      <w:r>
-        <w:t xml:space="preserve"> </w:t>
-      </w:r>
-      <w:r>
-        <w:rPr>
-          <w:iCs/>
-          <w:i/>
-        </w:rPr>
-        <w:t xml:space="preserve">Aguarda a fatia do Gabriel (G1).</w:t>
+        <w:t xml:space="preserve">Nicolas levantou a parte pública: 7 lojas, +180 colaboradores, CD próprio, unidade nova, estrutura multi-CNPJ, fundação em 1992. O Gabriel trouxe as cinco respostas de dentro (ver G1), e foram elas que reescreveram a oferta.</w:t>
       </w:r>
     </w:p>
     <w:bookmarkEnd w:id="42"/>
@@ -3060,17 +3193,23 @@
         <w:t xml:space="preserve"> </w:t>
       </w:r>
       <w:r>
-        <w:t xml:space="preserve">Três campos precisam sair preenchidos daquela reunião:</w:t>
-      </w:r>
-      <w:r>
-        <w:t xml:space="preserve"> </w:t>
-      </w:r>
-      <w:r>
-        <w:rPr>
-          <w:bCs/>
-          <w:b/>
-        </w:rPr>
-        <w:t xml:space="preserve">valor da Fase 1 · prazo da Fase 1 · faixa da Fase 2.</w:t>
+        <w:t xml:space="preserve">Dois campos precisam sair preenchidos daquela reunião:</w:t>
+      </w:r>
+      <w:r>
+        <w:t xml:space="preserve"> </w:t>
+      </w:r>
+      <w:r>
+        <w:rPr>
+          <w:bCs/>
+          <w:b/>
+        </w:rPr>
+        <w:t xml:space="preserve">valor da Consultoria · prazo da Consultoria.</w:t>
+      </w:r>
+      <w:r>
+        <w:t xml:space="preserve"> </w:t>
+      </w:r>
+      <w:r>
+        <w:t xml:space="preserve">(A faixa de implementação saiu da conta: em 14/ago o dono decidiu que segunda vende só a Consultoria.)</w:t>
       </w:r>
       <w:r>
         <w:t xml:space="preserve"> </w:t>
@@ -4444,10 +4583,13 @@
           <w:bCs/>
           <w:b/>
         </w:rPr>
-        <w:t xml:space="preserve">2. No Rocha especificamente, consultoria e implementação são vendidas juntas</w:t>
-      </w:r>
-      <w:r>
-        <w:t xml:space="preserve">, em duas fases com portão: Fase 1 com preço fechado agora, Fase 2 com faixa acordada e número fechado só no fim da Fase 1. Exceção declarada, vale só pra este caso.</w:t>
+        <w:t xml:space="preserve">2. O Rocha segue o funil padrão.</w:t>
+      </w:r>
+      <w:r>
+        <w:t xml:space="preserve"> </w:t>
+      </w:r>
+      <w:r>
+        <w:t xml:space="preserve">A exceção de vender consultoria e implementação juntas foi cogitada e revogada no mesmo dia. Segunda fecha só a Consultoria de IA; a produção vem depois, na entrega do diagnóstico.</w:t>
       </w:r>
     </w:p>
     <w:p>

</xml_diff>